<commit_message>
Refactor: Report-specific gate sequences
Weekly Tactical: Gates 1, 1A, 1B, 2-5, 1C, 6 (no source attribution)

Quarterly Geopolitical: All gates including 1D (source attribution)

Cleaner architecture - no conditional logic in gates

Co-authored-by: Cursor <cursoragent@cursor.com>
</commit_message>
<xml_diff>
--- a/CTI_Weekly_Report_2026-05-26.docx
+++ b/CTI_Weekly_Report_2026-05-26.docx
@@ -70,7 +70,7 @@
           <w:color w:val="333333"/>
           <w:sz w:val="21"/>
         </w:rPr>
-        <w:t>This week's threat landscape for our genomics and biotechnology environment is dominated by vulnerabilities in WordPress plugins, with several critical and high-severity CVEs detected across multiple systems. These vulnerabilities include SQL injection, cross-site scripting, unauthorized access, and sensitive information exposure, all of which could lead to compromise of research data, intellectual property, and patient information. Notably, CVE-2025-64293 presents a risk of SQL injection, while CVE-2024-13609 and CVE-2025-24582 expose sensitive information to unauthorized actors, increasing the risk of data theft and regulatory non-compliance. Several plugins are also vulnerable to unauthorized actions, which could allow attackers to manipulate system configurations or delete critical data. The presence of vulnerabilities such as CVE-2024-4367 and CVE-2023-49173 highlights the ongoing risk of web-based attacks, including cross-site scripting, which can be leveraged for session hijacking or further lateral movement within the environment. Industry threats such as AI-driven DDoS attacks and supply chain vulnerabilities are not currently detected in our environment but should be monitored for emerging risks [1]. State-sponsored actors from Iran and China, as well as criminal groups from Russia, remain highly active in targeting healthcare, manufacturing, and pharmaceutical sectors, underscoring the importance of rapid patching and continuous monitoring for anomalous activity.</w:t>
+        <w:t>This week's threat landscape for our genomics and biotechnology environment is dominated by vulnerabilities in WordPress plugins and themes, with several severe and critical exposures. Notably, CVE-2025-64293 presents a risk of SQL injection, potentially allowing attackers to access or manipulate sensitive research data and intellectual property. Multiple CVEs affecting the 12 Step Meeting List plugin (CVE-2024-22296, CVE-2024-35693, CVE-2025-24580, CVE-2025-24582, CVE-2025-24583, CVE-2025-54054, CVE-2026-39569, CVE-2026-39570) highlight persistent issues with authorization checks, information exposure, and cross-site scripting, which could compromise patient data, laboratory equipment, and regulatory compliance. These vulnerabilities are actively detected in our environment and require immediate attention to prevent unauthorized access, data loss, and potential disruption to laboratory and manufacturing operations. Threat actor activity remains high, with criminal and state-sponsored groups targeting healthcare, manufacturing, and pharmaceutical sectors. Ransomware, extortion, and database dumps are ongoing concerns, as confirmed by underground intelligence reports. While OSINT sources highlight industry threats such as AI-driven DDoS attacks and supply chain vulnerabilities in laboratory equipment, these are not currently detected in our environment but should be monitored closely for emerging risks [1].</w:t>
       </w:r>
     </w:p>
     <w:p>
@@ -202,7 +202,7 @@
                 <w:color w:val="FF5C41"/>
                 <w:sz w:val="44"/>
               </w:rPr>
-              <w:t>22</w:t>
+              <w:t>23</w:t>
             </w:r>
           </w:p>
           <w:p>
@@ -331,7 +331,7 @@
                 <w:color w:val="FF3B3B"/>
                 <w:sz w:val="44"/>
               </w:rPr>
-              <w:t>23</w:t>
+              <w:t>24</w:t>
             </w:r>
           </w:p>
           <w:p>
@@ -660,7 +660,7 @@
               </w:rPr>
               <w:t>WordPress Products</w:t>
               <w:br/>
-              <w:t>(23 CVEs)</w:t>
+              <w:t>(24 CVEs)</w:t>
             </w:r>
           </w:p>
         </w:tc>
@@ -680,7 +680,7 @@
                 <w:color w:val="333333"/>
                 <w:sz w:val="18"/>
               </w:rPr>
-              <w:t>Multiple products (23 vulnerabilities)</w:t>
+              <w:t>Multiple products (24 vulnerabilities)</w:t>
             </w:r>
           </w:p>
         </w:tc>
@@ -700,7 +700,7 @@
                 <w:color w:val="333333"/>
                 <w:sz w:val="18"/>
               </w:rPr>
-              <w:t>23 systems</w:t>
+              <w:t>24 systems</w:t>
             </w:r>
           </w:p>
         </w:tc>
@@ -741,7 +741,7 @@
           <w:color w:val="666666"/>
           <w:sz w:val="14"/>
         </w:rPr>
-        <w:t>Wks = consecutive weeks detected. Items at 3+ weeks (yellow) require escalation, 4+ weeks (red) are overdue. Bright red background indicates active exploitation (CISA KEV, ransomware, or threat actors). Table shows 0 individual CVEs (top by exposure/severity) and 1 technology groups covering 23 CVEs. Total: 23 CVEs detected. Source: Rapid7 InsightVM, CISA KEV, Intel471, CrowdStrike.</w:t>
+        <w:t>Wks = consecutive weeks detected. Items at 3+ weeks (yellow) require escalation, 4+ weeks (red) are overdue. Bright red background indicates active exploitation (CISA KEV, ransomware, or threat actors). Table shows 0 individual CVEs (top by exposure/severity) and 1 technology groups covering 24 CVEs. Total: 24 CVEs detected. Source: Rapid7 InsightVM, CISA KEV, Intel471, CrowdStrike.</w:t>
       </w:r>
     </w:p>
     <w:p/>
@@ -865,9 +865,9 @@
                 <w:color w:val="333333"/>
                 <w:sz w:val="18"/>
               </w:rPr>
-              <w:t>Iran</w:t>
+              <w:t>Unknown</w:t>
               <w:br/>
-              <w:t>State-Sponsored</w:t>
+              <w:t>Criminal</w:t>
             </w:r>
           </w:p>
         </w:tc>
@@ -887,7 +887,7 @@
                 <w:color w:val="333333"/>
                 <w:sz w:val="18"/>
               </w:rPr>
-              <w:t>HYDRO KITTEN</w:t>
+              <w:t>HOOK SPIDER</w:t>
             </w:r>
           </w:p>
         </w:tc>
@@ -908,7 +908,205 @@
                 <w:color w:val="333333"/>
                 <w:sz w:val="18"/>
               </w:rPr>
-              <w:t>Monitor for unauthorized access attempts, suspicious PowerShell activity, and anomalous outbound connections.</w:t>
+              <w:t>Monitor for unusual file encryption activity, unauthorized access attempts, and extortion communications.</w:t>
+            </w:r>
+          </w:p>
+        </w:tc>
+      </w:tr>
+      <w:tr>
+        <w:tc>
+          <w:tcPr>
+            <w:tcW w:type="dxa" w:w="3360"/>
+            <w:shd w:fill="F5F5F5" w:val="clear" w:color="auto"/>
+            <w:tcBorders>
+              <w:top w:val="single" w:sz="4" w:space="0" w:color="CCCCCC"/>
+              <w:bottom w:val="single" w:sz="4" w:space="0" w:color="CCCCCC"/>
+              <w:left w:val="single" w:sz="4" w:space="0" w:color="CCCCCC"/>
+              <w:right w:val="single" w:sz="4" w:space="0" w:color="CCCCCC"/>
+            </w:tcBorders>
+          </w:tcPr>
+          <w:p>
+            <w:r>
+              <w:rPr>
+                <w:color w:val="333333"/>
+                <w:sz w:val="18"/>
+              </w:rPr>
+              <w:t>Russian Federation</w:t>
+              <w:br/>
+              <w:t>Criminal</w:t>
+            </w:r>
+          </w:p>
+        </w:tc>
+        <w:tc>
+          <w:tcPr>
+            <w:tcW w:type="dxa" w:w="3360"/>
+            <w:tcBorders>
+              <w:top w:val="single" w:sz="4" w:space="0" w:color="CCCCCC"/>
+              <w:bottom w:val="single" w:sz="4" w:space="0" w:color="CCCCCC"/>
+              <w:left w:val="single" w:sz="4" w:space="0" w:color="CCCCCC"/>
+              <w:right w:val="single" w:sz="4" w:space="0" w:color="CCCCCC"/>
+            </w:tcBorders>
+          </w:tcPr>
+          <w:p>
+            <w:r>
+              <w:rPr>
+                <w:color w:val="333333"/>
+                <w:sz w:val="18"/>
+              </w:rPr>
+              <w:t>TRAVELING SPIDER</w:t>
+            </w:r>
+          </w:p>
+        </w:tc>
+        <w:tc>
+          <w:tcPr>
+            <w:tcW w:type="dxa" w:w="3360"/>
+            <w:shd w:fill="E3F2FD" w:val="clear" w:color="auto"/>
+            <w:tcBorders>
+              <w:top w:val="single" w:sz="4" w:space="0" w:color="CCCCCC"/>
+              <w:bottom w:val="single" w:sz="4" w:space="0" w:color="CCCCCC"/>
+              <w:left w:val="single" w:sz="4" w:space="0" w:color="CCCCCC"/>
+              <w:right w:val="single" w:sz="4" w:space="0" w:color="CCCCCC"/>
+            </w:tcBorders>
+          </w:tcPr>
+          <w:p>
+            <w:r>
+              <w:rPr>
+                <w:color w:val="333333"/>
+                <w:sz w:val="18"/>
+              </w:rPr>
+              <w:t>Monitor for credential harvesting, lateral movement, and suspicious outbound connections.</w:t>
+            </w:r>
+          </w:p>
+        </w:tc>
+      </w:tr>
+      <w:tr>
+        <w:tc>
+          <w:tcPr>
+            <w:tcW w:type="dxa" w:w="3360"/>
+            <w:shd w:fill="F5F5F5" w:val="clear" w:color="auto"/>
+            <w:tcBorders>
+              <w:top w:val="single" w:sz="4" w:space="0" w:color="CCCCCC"/>
+              <w:bottom w:val="single" w:sz="4" w:space="0" w:color="CCCCCC"/>
+              <w:left w:val="single" w:sz="4" w:space="0" w:color="CCCCCC"/>
+              <w:right w:val="single" w:sz="4" w:space="0" w:color="CCCCCC"/>
+            </w:tcBorders>
+          </w:tcPr>
+          <w:p>
+            <w:r>
+              <w:rPr>
+                <w:color w:val="333333"/>
+                <w:sz w:val="18"/>
+              </w:rPr>
+              <w:t>Unknown</w:t>
+              <w:br/>
+              <w:t>Criminal</w:t>
+            </w:r>
+          </w:p>
+        </w:tc>
+        <w:tc>
+          <w:tcPr>
+            <w:tcW w:type="dxa" w:w="3360"/>
+            <w:tcBorders>
+              <w:top w:val="single" w:sz="4" w:space="0" w:color="CCCCCC"/>
+              <w:bottom w:val="single" w:sz="4" w:space="0" w:color="CCCCCC"/>
+              <w:left w:val="single" w:sz="4" w:space="0" w:color="CCCCCC"/>
+              <w:right w:val="single" w:sz="4" w:space="0" w:color="CCCCCC"/>
+            </w:tcBorders>
+          </w:tcPr>
+          <w:p>
+            <w:r>
+              <w:rPr>
+                <w:color w:val="333333"/>
+                <w:sz w:val="18"/>
+              </w:rPr>
+              <w:t>VICE SPIDER</w:t>
+            </w:r>
+          </w:p>
+        </w:tc>
+        <w:tc>
+          <w:tcPr>
+            <w:tcW w:type="dxa" w:w="3360"/>
+            <w:shd w:fill="E3F2FD" w:val="clear" w:color="auto"/>
+            <w:tcBorders>
+              <w:top w:val="single" w:sz="4" w:space="0" w:color="CCCCCC"/>
+              <w:bottom w:val="single" w:sz="4" w:space="0" w:color="CCCCCC"/>
+              <w:left w:val="single" w:sz="4" w:space="0" w:color="CCCCCC"/>
+              <w:right w:val="single" w:sz="4" w:space="0" w:color="CCCCCC"/>
+            </w:tcBorders>
+          </w:tcPr>
+          <w:p>
+            <w:r>
+              <w:rPr>
+                <w:color w:val="333333"/>
+                <w:sz w:val="18"/>
+              </w:rPr>
+              <w:t>Monitor for ransomware payloads, unauthorized access, and data exfiltration.</w:t>
+            </w:r>
+          </w:p>
+        </w:tc>
+      </w:tr>
+      <w:tr>
+        <w:tc>
+          <w:tcPr>
+            <w:tcW w:type="dxa" w:w="3360"/>
+            <w:shd w:fill="F5F5F5" w:val="clear" w:color="auto"/>
+            <w:tcBorders>
+              <w:top w:val="single" w:sz="4" w:space="0" w:color="CCCCCC"/>
+              <w:bottom w:val="single" w:sz="4" w:space="0" w:color="CCCCCC"/>
+              <w:left w:val="single" w:sz="4" w:space="0" w:color="CCCCCC"/>
+              <w:right w:val="single" w:sz="4" w:space="0" w:color="CCCCCC"/>
+            </w:tcBorders>
+          </w:tcPr>
+          <w:p>
+            <w:r>
+              <w:rPr>
+                <w:color w:val="333333"/>
+                <w:sz w:val="18"/>
+              </w:rPr>
+              <w:t>Russian Federation</w:t>
+              <w:br/>
+              <w:t>Criminal</w:t>
+            </w:r>
+          </w:p>
+        </w:tc>
+        <w:tc>
+          <w:tcPr>
+            <w:tcW w:type="dxa" w:w="3360"/>
+            <w:tcBorders>
+              <w:top w:val="single" w:sz="4" w:space="0" w:color="CCCCCC"/>
+              <w:bottom w:val="single" w:sz="4" w:space="0" w:color="CCCCCC"/>
+              <w:left w:val="single" w:sz="4" w:space="0" w:color="CCCCCC"/>
+              <w:right w:val="single" w:sz="4" w:space="0" w:color="CCCCCC"/>
+            </w:tcBorders>
+          </w:tcPr>
+          <w:p>
+            <w:r>
+              <w:rPr>
+                <w:color w:val="333333"/>
+                <w:sz w:val="18"/>
+              </w:rPr>
+              <w:t>BITWISE SPIDER</w:t>
+            </w:r>
+          </w:p>
+        </w:tc>
+        <w:tc>
+          <w:tcPr>
+            <w:tcW w:type="dxa" w:w="3360"/>
+            <w:shd w:fill="E3F2FD" w:val="clear" w:color="auto"/>
+            <w:tcBorders>
+              <w:top w:val="single" w:sz="4" w:space="0" w:color="CCCCCC"/>
+              <w:bottom w:val="single" w:sz="4" w:space="0" w:color="CCCCCC"/>
+              <w:left w:val="single" w:sz="4" w:space="0" w:color="CCCCCC"/>
+              <w:right w:val="single" w:sz="4" w:space="0" w:color="CCCCCC"/>
+            </w:tcBorders>
+          </w:tcPr>
+          <w:p>
+            <w:r>
+              <w:rPr>
+                <w:color w:val="333333"/>
+                <w:sz w:val="18"/>
+              </w:rPr>
+              <w:t>Monitor for suspicious file activity, credential theft, and network anomalies.</w:t>
             </w:r>
           </w:p>
         </w:tc>
@@ -974,205 +1172,7 @@
                 <w:color w:val="333333"/>
                 <w:sz w:val="18"/>
               </w:rPr>
-              <w:t>Watch for credential harvesting, privilege escalation, and lateral movement within laboratory networks.</w:t>
-            </w:r>
-          </w:p>
-        </w:tc>
-      </w:tr>
-      <w:tr>
-        <w:tc>
-          <w:tcPr>
-            <w:tcW w:type="dxa" w:w="3360"/>
-            <w:shd w:fill="F5F5F5" w:val="clear" w:color="auto"/>
-            <w:tcBorders>
-              <w:top w:val="single" w:sz="4" w:space="0" w:color="CCCCCC"/>
-              <w:bottom w:val="single" w:sz="4" w:space="0" w:color="CCCCCC"/>
-              <w:left w:val="single" w:sz="4" w:space="0" w:color="CCCCCC"/>
-              <w:right w:val="single" w:sz="4" w:space="0" w:color="CCCCCC"/>
-            </w:tcBorders>
-          </w:tcPr>
-          <w:p>
-            <w:r>
-              <w:rPr>
-                <w:color w:val="333333"/>
-                <w:sz w:val="18"/>
-              </w:rPr>
-              <w:t>China</w:t>
-              <w:br/>
-              <w:t>State-Sponsored</w:t>
-            </w:r>
-          </w:p>
-        </w:tc>
-        <w:tc>
-          <w:tcPr>
-            <w:tcW w:type="dxa" w:w="3360"/>
-            <w:tcBorders>
-              <w:top w:val="single" w:sz="4" w:space="0" w:color="CCCCCC"/>
-              <w:bottom w:val="single" w:sz="4" w:space="0" w:color="CCCCCC"/>
-              <w:left w:val="single" w:sz="4" w:space="0" w:color="CCCCCC"/>
-              <w:right w:val="single" w:sz="4" w:space="0" w:color="CCCCCC"/>
-            </w:tcBorders>
-          </w:tcPr>
-          <w:p>
-            <w:r>
-              <w:rPr>
-                <w:color w:val="333333"/>
-                <w:sz w:val="18"/>
-              </w:rPr>
-              <w:t>VAULT PANDA</w:t>
-            </w:r>
-          </w:p>
-        </w:tc>
-        <w:tc>
-          <w:tcPr>
-            <w:tcW w:type="dxa" w:w="3360"/>
-            <w:shd w:fill="E3F2FD" w:val="clear" w:color="auto"/>
-            <w:tcBorders>
-              <w:top w:val="single" w:sz="4" w:space="0" w:color="CCCCCC"/>
-              <w:bottom w:val="single" w:sz="4" w:space="0" w:color="CCCCCC"/>
-              <w:left w:val="single" w:sz="4" w:space="0" w:color="CCCCCC"/>
-              <w:right w:val="single" w:sz="4" w:space="0" w:color="CCCCCC"/>
-            </w:tcBorders>
-          </w:tcPr>
-          <w:p>
-            <w:r>
-              <w:rPr>
-                <w:color w:val="333333"/>
-                <w:sz w:val="18"/>
-              </w:rPr>
-              <w:t>Monitor for suspicious file transfers, unusual authentication patterns, and data exfiltration.</w:t>
-            </w:r>
-          </w:p>
-        </w:tc>
-      </w:tr>
-      <w:tr>
-        <w:tc>
-          <w:tcPr>
-            <w:tcW w:type="dxa" w:w="3360"/>
-            <w:shd w:fill="F5F5F5" w:val="clear" w:color="auto"/>
-            <w:tcBorders>
-              <w:top w:val="single" w:sz="4" w:space="0" w:color="CCCCCC"/>
-              <w:bottom w:val="single" w:sz="4" w:space="0" w:color="CCCCCC"/>
-              <w:left w:val="single" w:sz="4" w:space="0" w:color="CCCCCC"/>
-              <w:right w:val="single" w:sz="4" w:space="0" w:color="CCCCCC"/>
-            </w:tcBorders>
-          </w:tcPr>
-          <w:p>
-            <w:r>
-              <w:rPr>
-                <w:color w:val="333333"/>
-                <w:sz w:val="18"/>
-              </w:rPr>
-              <w:t>Russian Federation</w:t>
-              <w:br/>
-              <w:t>Criminal</w:t>
-            </w:r>
-          </w:p>
-        </w:tc>
-        <w:tc>
-          <w:tcPr>
-            <w:tcW w:type="dxa" w:w="3360"/>
-            <w:tcBorders>
-              <w:top w:val="single" w:sz="4" w:space="0" w:color="CCCCCC"/>
-              <w:bottom w:val="single" w:sz="4" w:space="0" w:color="CCCCCC"/>
-              <w:left w:val="single" w:sz="4" w:space="0" w:color="CCCCCC"/>
-              <w:right w:val="single" w:sz="4" w:space="0" w:color="CCCCCC"/>
-            </w:tcBorders>
-          </w:tcPr>
-          <w:p>
-            <w:r>
-              <w:rPr>
-                <w:color w:val="333333"/>
-                <w:sz w:val="18"/>
-              </w:rPr>
-              <w:t>BITWISE SPIDER</w:t>
-            </w:r>
-          </w:p>
-        </w:tc>
-        <w:tc>
-          <w:tcPr>
-            <w:tcW w:type="dxa" w:w="3360"/>
-            <w:shd w:fill="E3F2FD" w:val="clear" w:color="auto"/>
-            <w:tcBorders>
-              <w:top w:val="single" w:sz="4" w:space="0" w:color="CCCCCC"/>
-              <w:bottom w:val="single" w:sz="4" w:space="0" w:color="CCCCCC"/>
-              <w:left w:val="single" w:sz="4" w:space="0" w:color="CCCCCC"/>
-              <w:right w:val="single" w:sz="4" w:space="0" w:color="CCCCCC"/>
-            </w:tcBorders>
-          </w:tcPr>
-          <w:p>
-            <w:r>
-              <w:rPr>
-                <w:color w:val="333333"/>
-                <w:sz w:val="18"/>
-              </w:rPr>
-              <w:t>Scan for ransomware indicators, unauthorized encryption activity, and extortion attempts.</w:t>
-            </w:r>
-          </w:p>
-        </w:tc>
-      </w:tr>
-      <w:tr>
-        <w:tc>
-          <w:tcPr>
-            <w:tcW w:type="dxa" w:w="3360"/>
-            <w:shd w:fill="F5F5F5" w:val="clear" w:color="auto"/>
-            <w:tcBorders>
-              <w:top w:val="single" w:sz="4" w:space="0" w:color="CCCCCC"/>
-              <w:bottom w:val="single" w:sz="4" w:space="0" w:color="CCCCCC"/>
-              <w:left w:val="single" w:sz="4" w:space="0" w:color="CCCCCC"/>
-              <w:right w:val="single" w:sz="4" w:space="0" w:color="CCCCCC"/>
-            </w:tcBorders>
-          </w:tcPr>
-          <w:p>
-            <w:r>
-              <w:rPr>
-                <w:color w:val="333333"/>
-                <w:sz w:val="18"/>
-              </w:rPr>
-              <w:t>Unknown</w:t>
-              <w:br/>
-              <w:t>Criminal</w:t>
-            </w:r>
-          </w:p>
-        </w:tc>
-        <w:tc>
-          <w:tcPr>
-            <w:tcW w:type="dxa" w:w="3360"/>
-            <w:tcBorders>
-              <w:top w:val="single" w:sz="4" w:space="0" w:color="CCCCCC"/>
-              <w:bottom w:val="single" w:sz="4" w:space="0" w:color="CCCCCC"/>
-              <w:left w:val="single" w:sz="4" w:space="0" w:color="CCCCCC"/>
-              <w:right w:val="single" w:sz="4" w:space="0" w:color="CCCCCC"/>
-            </w:tcBorders>
-          </w:tcPr>
-          <w:p>
-            <w:r>
-              <w:rPr>
-                <w:color w:val="333333"/>
-                <w:sz w:val="18"/>
-              </w:rPr>
-              <w:t>HOOK SPIDER</w:t>
-            </w:r>
-          </w:p>
-        </w:tc>
-        <w:tc>
-          <w:tcPr>
-            <w:tcW w:type="dxa" w:w="3360"/>
-            <w:shd w:fill="E3F2FD" w:val="clear" w:color="auto"/>
-            <w:tcBorders>
-              <w:top w:val="single" w:sz="4" w:space="0" w:color="CCCCCC"/>
-              <w:bottom w:val="single" w:sz="4" w:space="0" w:color="CCCCCC"/>
-              <w:left w:val="single" w:sz="4" w:space="0" w:color="CCCCCC"/>
-              <w:right w:val="single" w:sz="4" w:space="0" w:color="CCCCCC"/>
-            </w:tcBorders>
-          </w:tcPr>
-          <w:p>
-            <w:r>
-              <w:rPr>
-                <w:color w:val="333333"/>
-                <w:sz w:val="18"/>
-              </w:rPr>
-              <w:t>Monitor for phishing campaigns, privilege escalation, and unauthorized access to laboratory equipment.</w:t>
+              <w:t>Monitor for spear phishing, privilege escalation, and unauthorized access to research data.</w:t>
             </w:r>
           </w:p>
         </w:tc>
@@ -1201,7 +1201,7 @@
           <w:b/>
           <w:sz w:val="20"/>
         </w:rPr>
-        <w:t>Patch all affected WordPress plugins and themes immediately to remediate detected vulnerabilities.</w:t>
+        <w:t>Patch or update all affected WordPress plugins and themes immediately, prioritizing those with severe and critical vulnerabilities.</w:t>
       </w:r>
     </w:p>
     <w:p>
@@ -1212,7 +1212,7 @@
         <w:rPr>
           <w:sz w:val="20"/>
         </w:rPr>
-        <w:t>Review and restrict user permissions for plugins, ensuring only authorized personnel have access to administrative functions.</w:t>
+        <w:t>Review and restrict user permissions for plugins, ensuring only authorized personnel have access to sensitive functions.</w:t>
       </w:r>
     </w:p>
     <w:p>
@@ -1223,7 +1223,7 @@
         <w:rPr>
           <w:sz w:val="20"/>
         </w:rPr>
-        <w:t>Implement web application firewalls and enable input validation to mitigate risks from cross-site scripting and SQL injection.</w:t>
+        <w:t>Implement web application firewalls and enable strict input validation to mitigate SQL injection and cross-site scripting risks.</w:t>
       </w:r>
     </w:p>
     <w:p>
@@ -1234,7 +1234,7 @@
         <w:rPr>
           <w:sz w:val="20"/>
         </w:rPr>
-        <w:t>Conduct regular backups of research and patient data, and verify restoration procedures to ensure business continuity.</w:t>
+        <w:t>Conduct regular backups of research and patient data, ensuring backups are stored securely and tested for integrity.</w:t>
       </w:r>
     </w:p>
     <w:p>
@@ -1245,7 +1245,7 @@
         <w:rPr>
           <w:sz w:val="20"/>
         </w:rPr>
-        <w:t>Monitor for anomalous activity, including unauthorized access attempts and privilege escalation, especially from regions associated with state-sponsored actors.</w:t>
+        <w:t>Monitor for unauthorized access attempts, unusual file activity, and signs of ransomware or extortion in laboratory and manufacturing systems.</w:t>
       </w:r>
     </w:p>
     <w:p/>
@@ -1378,7 +1378,7 @@
             <w:color w:val="0563C1"/>
             <w:u w:val="single"/>
           </w:rPr>
-          <w:t>AI DDoS Webinar</w:t>
+          <w:t>AI DDoS Attacks</w:t>
         </w:r>
       </w:hyperlink>
       <w:r>
@@ -1387,7 +1387,7 @@
           <w:color w:val="666666"/>
           <w:sz w:val="16"/>
         </w:rPr>
-        <w:t xml:space="preserve"> - Highlights emerging AI-driven DDoS threats relevant to biotech and manufacturing sectors.</w:t>
+        <w:t xml:space="preserve"> - Highlights emerging AI-driven DDoS threats relevant to healthcare and manufacturing supply chains.</w:t>
       </w:r>
     </w:p>
     <w:p/>

</xml_diff>